<commit_message>
Strengthen article title and opening
</commit_message>
<xml_diff>
--- a/article/X发布包/X文章发布稿.docx
+++ b/article/X发布包/X文章发布稿.docx
@@ -14,7 +14,7 @@
           <w:color w:val="000000"/>
           <w:sz w:val="48"/>
         </w:rPr>
-        <w:t>这个 Skill，可以批量自动生成末日逃生避难所视频</w:t>
+        <w:t>3个月发25篇，涨粉3.6万、获赞26万，我把这套庇护所视频工作流开源了</w:t>
       </w:r>
     </w:p>
     <w:p>
@@ -28,7 +28,49 @@
           <w:color w:val="262D34"/>
           <w:sz w:val="22"/>
         </w:rPr>
-        <w:t>过去一段时间，我一直在做一种末日逃生视频。</w:t>
+        <w:t>最近，我拆解了一个末日逃生庇护所类视频账号。</w:t>
+      </w:r>
+    </w:p>
+    <w:p>
+      <w:pPr>
+        <w:spacing w:line="348" w:lineRule="auto" w:after="160"/>
+      </w:pPr>
+      <w:r>
+        <w:rPr>
+          <w:rFonts w:ascii="Microsoft YaHei UI" w:hAnsi="Microsoft YaHei UI" w:eastAsia="Microsoft YaHei UI"/>
+          <w:b w:val="0"/>
+          <w:color w:val="262D34"/>
+          <w:sz w:val="22"/>
+        </w:rPr>
+        <w:t>这个账号只用了 3 个月，就在小红书发布了 25 篇笔记，涨粉 3.6 万，累计获赞 26 万。按 25 篇粗略平均，每篇带来约 1440 名新增粉丝和超过 1 万次点赞。</w:t>
+      </w:r>
+    </w:p>
+    <w:p>
+      <w:pPr>
+        <w:spacing w:line="348" w:lineRule="auto" w:after="160"/>
+      </w:pPr>
+      <w:r>
+        <w:rPr>
+          <w:rFonts w:ascii="Microsoft YaHei UI" w:hAnsi="Microsoft YaHei UI" w:eastAsia="Microsoft YaHei UI"/>
+          <w:b w:val="0"/>
+          <w:color w:val="262D34"/>
+          <w:sz w:val="22"/>
+        </w:rPr>
+        <w:t>这个结果真正让我在意的，不只是题材带来的视觉冲击，而是它证明了一件事：末日庇护所并不是只能偶尔做出一条爆款，它完全可以被拆成一套能够连续更新、反复复用的内容结构。</w:t>
+      </w:r>
+    </w:p>
+    <w:p>
+      <w:pPr>
+        <w:spacing w:line="348" w:lineRule="auto" w:after="160"/>
+      </w:pPr>
+      <w:r>
+        <w:rPr>
+          <w:rFonts w:ascii="Microsoft YaHei UI" w:hAnsi="Microsoft YaHei UI" w:eastAsia="Microsoft YaHei UI"/>
+          <w:b w:val="0"/>
+          <w:color w:val="262D34"/>
+          <w:sz w:val="22"/>
+        </w:rPr>
+        <w:t>所以，我开始顺着它的镜头、动作、空间和转场，一层层往下拆。</w:t>
       </w:r>
     </w:p>
     <w:p>
@@ -266,7 +308,7 @@
       <w:r>
         <w:drawing>
           <wp:inline xmlns:a="http://schemas.openxmlformats.org/drawingml/2006/main" xmlns:pic="http://schemas.openxmlformats.org/drawingml/2006/picture">
-            <wp:extent cx="5806440" cy="3483864"/>
+            <wp:extent cx="4114800" cy="2468880"/>
             <wp:docPr id="1" name="Picture 1"/>
             <wp:cNvGraphicFramePr>
               <a:graphicFrameLocks noChangeAspect="1"/>
@@ -287,7 +329,7 @@
                   <pic:spPr>
                     <a:xfrm>
                       <a:off x="0" y="0"/>
-                      <a:ext cx="5806440" cy="3483864"/>
+                      <a:ext cx="4114800" cy="2468880"/>
                     </a:xfrm>
                     <a:prstGeom prst="rect"/>
                   </pic:spPr>

</xml_diff>

<commit_message>
Document video generation routes
</commit_message>
<xml_diff>
--- a/article/X发布包/X文章发布稿.docx
+++ b/article/X发布包/X文章发布稿.docx
@@ -196,7 +196,7 @@
           <w:color w:val="262D34"/>
           <w:sz w:val="22"/>
         </w:rPr>
-        <w:t>它可以从随机灾难和主题物开始，自动完成逃生场景、庇护所外观、两个内部空间、四张关键帧、两段 15 秒双语视频提示词和发布文案。你明确授权以后，它还可以继续调用可用的视频生成工具，按批次生成成片。</w:t>
+        <w:t>它可以从随机灾难和主题物开始，自动完成逃生场景、庇护所外观、两个内部空间、四张关键帧、两段 15 秒双语视频提示词和发布文案。你明确授权以后，它还可以根据当前环境调用即梦 CLI 自动生成视频，或者接入 RunningHub 在远端生成。如果你更习惯自己控制模型，也可以只让它输出适配 MiniMax H3 的提示词和参考帧，再手动完成生成。</w:t>
       </w:r>
     </w:p>
     <w:p>
@@ -805,6 +805,108 @@
     </w:p>
     <w:p>
       <w:pPr>
+        <w:pStyle w:val="Heading2"/>
+        <w:keepNext/>
+        <w:spacing w:before="360" w:after="160"/>
+      </w:pPr>
+      <w:r>
+        <w:rPr>
+          <w:rFonts w:ascii="Microsoft YaHei UI" w:hAnsi="Microsoft YaHei UI" w:eastAsia="Microsoft YaHei UI"/>
+          <w:b/>
+          <w:color w:val="000000"/>
+          <w:sz w:val="28"/>
+        </w:rPr>
+        <w:t>视频生成有三条可选路线</w:t>
+      </w:r>
+    </w:p>
+    <w:p>
+      <w:pPr>
+        <w:spacing w:line="348" w:lineRule="auto" w:after="160"/>
+      </w:pPr>
+      <w:r>
+        <w:rPr>
+          <w:rFonts w:ascii="Microsoft YaHei UI" w:hAnsi="Microsoft YaHei UI" w:eastAsia="Microsoft YaHei UI"/>
+          <w:b w:val="0"/>
+          <w:color w:val="262D34"/>
+          <w:sz w:val="22"/>
+        </w:rPr>
+        <w:t>第一种是即梦 CLI。电脑里已经安装并配置好即梦 CLI 时，Skill 可以在你确认任务数量、模型和费用以后直接提交两段视频，等待任务完成并返回结果。这条路线适合希望从内容包一直自动跑到成片的人。</w:t>
+      </w:r>
+    </w:p>
+    <w:p>
+      <w:pPr>
+        <w:spacing w:line="348" w:lineRule="auto" w:after="160"/>
+      </w:pPr>
+      <w:r>
+        <w:rPr>
+          <w:rFonts w:ascii="Microsoft YaHei UI" w:hAnsi="Microsoft YaHei UI" w:eastAsia="Microsoft YaHei UI"/>
+          <w:b w:val="0"/>
+          <w:color w:val="262D34"/>
+          <w:sz w:val="22"/>
+        </w:rPr>
+        <w:t>第二种是 MiniMax H3。Skill 不必直接连接平台，而是输出两段已经拆好时间轴、动作、镜头、首尾帧和参考帧映射的提示词。你可以先检查关键帧，再把提示词和图片手动放进 MiniMax H3。这样更适合想自己选择模型版本、逐段调整参数，或者需要在提交前再看一遍素材的人。</w:t>
+      </w:r>
+    </w:p>
+    <w:p>
+      <w:pPr>
+        <w:spacing w:line="348" w:lineRule="auto" w:after="160"/>
+      </w:pPr>
+      <w:r>
+        <w:rPr>
+          <w:rFonts w:ascii="Microsoft YaHei UI" w:hAnsi="Microsoft YaHei UI" w:eastAsia="Microsoft YaHei UI"/>
+          <w:b w:val="0"/>
+          <w:color w:val="262D34"/>
+          <w:sz w:val="22"/>
+        </w:rPr>
+        <w:t>第三种是 RunningHub。接入 RunningHub 以后，可以把已经确认的工作流放到远端执行，本地只负责准备提示词、参考图、参数和读取任务状态。显卡和模型主要运行在远端，更适合批量任务，也能减少本地电脑长时间占用显存和内存。</w:t>
+      </w:r>
+    </w:p>
+    <w:p>
+      <w:pPr>
+        <w:pStyle w:val="Heading2"/>
+        <w:keepNext/>
+        <w:spacing w:before="360" w:after="160"/>
+      </w:pPr>
+      <w:r>
+        <w:rPr>
+          <w:rFonts w:ascii="Microsoft YaHei UI" w:hAnsi="Microsoft YaHei UI" w:eastAsia="Microsoft YaHei UI"/>
+          <w:b/>
+          <w:color w:val="000000"/>
+          <w:sz w:val="28"/>
+        </w:rPr>
+        <w:t>为什么不默认自动连接本地 ComfyUI</w:t>
+      </w:r>
+    </w:p>
+    <w:p>
+      <w:pPr>
+        <w:spacing w:line="348" w:lineRule="auto" w:after="160"/>
+      </w:pPr>
+      <w:r>
+        <w:rPr>
+          <w:rFonts w:ascii="Microsoft YaHei UI" w:hAnsi="Microsoft YaHei UI" w:eastAsia="Microsoft YaHei UI"/>
+          <w:b w:val="0"/>
+          <w:color w:val="262D34"/>
+          <w:sz w:val="22"/>
+        </w:rPr>
+        <w:t>我没有把本地 ComfyUI 的 MCP 调用设成默认自动路线。ComfyUI 在加载视频模型和处理多张参考图时，本身就会占用大量显存、内存、CPU 和磁盘读写。如果同时让 Agent 通过 MCP 保持连接、提交节点参数并持续查询状态，实际使用中更容易遇到超时、连接中断、状态回传失败或者任务已经在运行但 MCP 先报错的情况。</w:t>
+      </w:r>
+    </w:p>
+    <w:p>
+      <w:pPr>
+        <w:spacing w:line="348" w:lineRule="auto" w:after="160"/>
+      </w:pPr>
+      <w:r>
+        <w:rPr>
+          <w:rFonts w:ascii="Microsoft YaHei UI" w:hAnsi="Microsoft YaHei UI" w:eastAsia="Microsoft YaHei UI"/>
+          <w:b w:val="0"/>
+          <w:color w:val="262D34"/>
+          <w:sz w:val="22"/>
+        </w:rPr>
+        <w:t>这不代表本地 ComfyUI 不能生成，而是它不适合被当成默认的一键批量通道。电脑配置充足、工作流已经稳定时，仍然可以在明确授权后接入；但日常使用里，我更建议把 ComfyUI 工作流手动打开，用 Skill 生成的提示词和参考帧运行。需要自动批量时，优先选择即梦 CLI 或 RunningHub，稳定性通常更好。</w:t>
+      </w:r>
+    </w:p>
+    <w:p>
+      <w:pPr>
         <w:pStyle w:val="Heading1"/>
         <w:keepNext/>
         <w:spacing w:before="360" w:after="160"/>
@@ -1030,7 +1132,21 @@
           <w:color w:val="262D34"/>
           <w:sz w:val="22"/>
         </w:rPr>
-        <w:t>实际生成视频时，要留意平台的费用、审核、时长和参考图数量限制。平台返回“生成成功”只代表文件已经生成，不代表动作、声音和连续性一定符合预期。是否重做，仍然应该由你看完成片以后决定。</w:t>
+        <w:t>实际生成视频时，要留意平台的费用、审核、时长和参考图数量限制。即梦 CLI 和 RunningHub 适合在明确授权后继续自动执行；MiniMax H3 则可以保留人工提交和调参的空间。平台返回“生成成功”只代表文件已经生成，不代表动作、声音和连续性一定符合预期。是否重做，仍然应该由你看完成片以后决定。</w:t>
+      </w:r>
+    </w:p>
+    <w:p>
+      <w:pPr>
+        <w:spacing w:line="348" w:lineRule="auto" w:after="160"/>
+      </w:pPr>
+      <w:r>
+        <w:rPr>
+          <w:rFonts w:ascii="Microsoft YaHei UI" w:hAnsi="Microsoft YaHei UI" w:eastAsia="Microsoft YaHei UI"/>
+          <w:b w:val="0"/>
+          <w:color w:val="262D34"/>
+          <w:sz w:val="22"/>
+        </w:rPr>
+        <w:t>如果你准备使用本地 ComfyUI，建议先单独确认模型能够正常加载、显存余量足够、工作流可以手动跑通，再决定是否接入 MCP。不要在本地模型已经满载时，继续叠加自动调用和长时间状态查询，否则一次通信报错就可能让 Agent 无法判断任务究竟失败了，还是仍在后台运行。</w:t>
       </w:r>
     </w:p>
     <w:p>

</xml_diff>